<commit_message>
Manuscript round-2: Supp Table 4, Table 3, and the audit trail
Adds Supplementary Table 4 (per-replicate structural observables for every
simulated system) and main-text Table 3, both emitted by one new script so they
cannot drift apart. Regenerates Supplementary Table 3, whose FEP sheet still
carried the pre-Lever-C G190E (+0.99 +/- 1.63) against Table 2's -1.02 +/- 0.38.

The moiety contact analysis had only ever been run on 4 of 20 systems; rerunning
it across the panel is what moves dor_moiety_contacts_*.csv here.

Also commits the working notes behind the round: the full manuscript audit, the
paste-ready edits, the new Results subsection and the Figure 3 / Table 3 /
Discussion rewrite.

Co-Authored-By: Claude Opus 5 <noreply@anthropic.com>
</commit_message>
<xml_diff>
--- a/manuscript/post-feedback-from-atanu/Supplementary Text.docx
+++ b/manuscript/post-feedback-from-atanu/Supplementary Text.docx
@@ -800,7 +800,7 @@
         </w:rPr>
         <w:lastRenderedPageBreak/>
         <w:drawing>
-          <wp:anchor distT="0" distB="0" distL="114300" distR="114300" simplePos="0" relativeHeight="251658240" behindDoc="0" locked="0" layoutInCell="1" allowOverlap="1" wp14:anchorId="204E281E" wp14:editId="11E3E4F8">
+          <wp:anchor distT="0" distB="0" distL="114300" distR="114300" simplePos="0" relativeHeight="251658240" behindDoc="0" locked="0" layoutInCell="1" allowOverlap="1" wp14:anchorId="204E281E" wp14:editId="78A1126C">
             <wp:simplePos x="0" y="0"/>
             <wp:positionH relativeFrom="column">
               <wp:posOffset>0</wp:posOffset>
@@ -1043,184 +1043,6 @@
           <w:szCs w:val="20"/>
         </w:rPr>
       </w:pPr>
-    </w:p>
-    <w:p>
-      <w:pPr>
-        <w:rPr>
-          <w:rFonts w:ascii="Times New Roman" w:hAnsi="Times New Roman" w:cs="Times New Roman"/>
-          <w:sz w:val="20"/>
-          <w:szCs w:val="20"/>
-        </w:rPr>
-      </w:pPr>
-      <w:r>
-        <w:rPr>
-          <w:rFonts w:ascii="Times New Roman" w:hAnsi="Times New Roman" w:cs="Times New Roman"/>
-          <w:b/>
-          <w:bCs/>
-          <w:noProof/>
-          <w:sz w:val="20"/>
-          <w:szCs w:val="20"/>
-        </w:rPr>
-        <w:lastRenderedPageBreak/>
-        <w:drawing>
-          <wp:inline distT="0" distB="0" distL="0" distR="0" wp14:anchorId="7457BD3B" wp14:editId="4706F55D">
-            <wp:extent cx="5943600" cy="2352040"/>
-            <wp:effectExtent l="0" t="0" r="0" b="0"/>
-            <wp:docPr id="1642514402" name="Picture 1"/>
-            <wp:cNvGraphicFramePr>
-              <a:graphicFrameLocks xmlns:a="http://schemas.openxmlformats.org/drawingml/2006/main" noChangeAspect="1"/>
-            </wp:cNvGraphicFramePr>
-            <a:graphic xmlns:a="http://schemas.openxmlformats.org/drawingml/2006/main">
-              <a:graphicData uri="http://schemas.openxmlformats.org/drawingml/2006/picture">
-                <pic:pic xmlns:pic="http://schemas.openxmlformats.org/drawingml/2006/picture">
-                  <pic:nvPicPr>
-                    <pic:cNvPr id="1642514402" name="Picture 1642514402"/>
-                    <pic:cNvPicPr/>
-                  </pic:nvPicPr>
-                  <pic:blipFill>
-                    <a:blip r:embed="rId8"/>
-                    <a:stretch>
-                      <a:fillRect/>
-                    </a:stretch>
-                  </pic:blipFill>
-                  <pic:spPr>
-                    <a:xfrm>
-                      <a:off x="0" y="0"/>
-                      <a:ext cx="5943600" cy="2352040"/>
-                    </a:xfrm>
-                    <a:prstGeom prst="rect">
-                      <a:avLst/>
-                    </a:prstGeom>
-                  </pic:spPr>
-                </pic:pic>
-              </a:graphicData>
-            </a:graphic>
-          </wp:inline>
-        </w:drawing>
-      </w:r>
-      <w:r>
-        <w:rPr>
-          <w:rFonts w:ascii="Times New Roman" w:hAnsi="Times New Roman" w:cs="Times New Roman"/>
-          <w:b/>
-          <w:bCs/>
-          <w:sz w:val="20"/>
-          <w:szCs w:val="20"/>
-        </w:rPr>
-        <w:t xml:space="preserve">Supplementary </w:t>
-      </w:r>
-      <w:r>
-        <w:rPr>
-          <w:rFonts w:ascii="Times New Roman" w:hAnsi="Times New Roman" w:cs="Times New Roman"/>
-          <w:b/>
-          <w:bCs/>
-          <w:sz w:val="20"/>
-          <w:szCs w:val="20"/>
-        </w:rPr>
-        <w:t>Figure 3: Trajectory-level evidence for two distinct resistance mechanisms.</w:t>
-      </w:r>
-      <w:r>
-        <w:rPr>
-          <w:rFonts w:ascii="Times New Roman" w:hAnsi="Times New Roman" w:cs="Times New Roman"/>
-          <w:sz w:val="20"/>
-          <w:szCs w:val="20"/>
-        </w:rPr>
-        <w:t xml:space="preserve"> </w:t>
-      </w:r>
-    </w:p>
-    <w:p>
-      <w:pPr>
-        <w:rPr>
-          <w:rFonts w:ascii="Times New Roman" w:hAnsi="Times New Roman" w:cs="Times New Roman"/>
-          <w:sz w:val="16"/>
-          <w:szCs w:val="13"/>
-        </w:rPr>
-      </w:pPr>
-      <w:r>
-        <w:rPr>
-          <w:rFonts w:ascii="Times New Roman" w:hAnsi="Times New Roman" w:cs="Times New Roman"/>
-          <w:b/>
-          <w:bCs/>
-          <w:sz w:val="20"/>
-          <w:szCs w:val="20"/>
-        </w:rPr>
-        <w:t>(A)</w:t>
-      </w:r>
-      <w:r>
-        <w:rPr>
-          <w:rFonts w:ascii="Times New Roman" w:hAnsi="Times New Roman" w:cs="Times New Roman"/>
-          <w:sz w:val="20"/>
-          <w:szCs w:val="20"/>
-        </w:rPr>
-        <w:t xml:space="preserve"> Burial of the DOR </w:t>
-      </w:r>
-      <w:proofErr w:type="spellStart"/>
-      <w:r>
-        <w:rPr>
-          <w:rFonts w:ascii="Times New Roman" w:hAnsi="Times New Roman" w:cs="Times New Roman"/>
-          <w:sz w:val="20"/>
-          <w:szCs w:val="20"/>
-        </w:rPr>
-        <w:t>chlorocyanophenyl</w:t>
-      </w:r>
-      <w:proofErr w:type="spellEnd"/>
-      <w:r>
-        <w:rPr>
-          <w:rFonts w:ascii="Times New Roman" w:hAnsi="Times New Roman" w:cs="Times New Roman"/>
-          <w:sz w:val="20"/>
-          <w:szCs w:val="20"/>
-        </w:rPr>
-        <w:t xml:space="preserve"> ring, defined as the number of protein heavy atom</w:t>
-      </w:r>
-      <w:r>
-        <w:rPr>
-          <w:rFonts w:ascii="Times New Roman" w:hAnsi="Times New Roman" w:cs="Times New Roman"/>
-          <w:sz w:val="20"/>
-          <w:szCs w:val="20"/>
-        </w:rPr>
-        <w:t xml:space="preserve"> contacts</w:t>
-      </w:r>
-      <w:r>
-        <w:rPr>
-          <w:rFonts w:ascii="Times New Roman" w:hAnsi="Times New Roman" w:cs="Times New Roman"/>
-          <w:sz w:val="20"/>
-          <w:szCs w:val="20"/>
-        </w:rPr>
-        <w:t xml:space="preserve"> within 4.</w:t>
-      </w:r>
-      <w:r>
-        <w:rPr>
-          <w:rFonts w:ascii="Times New Roman" w:hAnsi="Times New Roman" w:cs="Times New Roman"/>
-          <w:sz w:val="20"/>
-          <w:szCs w:val="20"/>
-        </w:rPr>
-        <w:t>0</w:t>
-      </w:r>
-      <w:r>
-        <w:rPr>
-          <w:rFonts w:ascii="Times New Roman" w:hAnsi="Times New Roman" w:cs="Times New Roman"/>
-          <w:sz w:val="20"/>
-          <w:szCs w:val="20"/>
-        </w:rPr>
-        <w:t xml:space="preserve"> Å of the ring, for WT and Y188L. </w:t>
-      </w:r>
-      <w:r>
-        <w:rPr>
-          <w:rFonts w:ascii="Times New Roman" w:hAnsi="Times New Roman" w:cs="Times New Roman"/>
-          <w:b/>
-          <w:bCs/>
-          <w:sz w:val="20"/>
-          <w:szCs w:val="20"/>
-        </w:rPr>
-        <w:t xml:space="preserve">(B) </w:t>
-      </w:r>
-      <w:r>
-        <w:rPr>
-          <w:rFonts w:ascii="Times New Roman" w:hAnsi="Times New Roman" w:cs="Times New Roman"/>
-          <w:sz w:val="20"/>
-          <w:szCs w:val="20"/>
-        </w:rPr>
-        <w:t>Displacement of DOR toward Ser105, defined as the minimum heavy-atom distance between DOR and the Ser105 side chain, for WT and the four V106A-containing genotypes (cf. Table 2). Solid lines are means over three independent 100 ns replicates interpolated onto a common time grid; shading is the standard error of the mean across replicates.</w:t>
-      </w:r>
     </w:p>
     <w:sectPr>
       <w:pgSz w:w="12240" w:h="15840"/>

</xml_diff>